<commit_message>
PP Task 3: use learner's own phone number for WhatsApp widget
</commit_message>
<xml_diff>
--- a/courseware/Answers to PP Assessment -Agentic AI Applications with Claude Code- v3.docx
+++ b/courseware/Answers to PP Assessment -Agentic AI Applications with Claude Code- v3.docx
@@ -885,7 +885,7 @@
           <w:bCs w:val="1"/>
           <w:rtl w:val="0"/>
         </w:rPr>
-        <w:t>Task 3: Add a WhatsApp floating widget to the website (linked to +65 9698 3731) and show it on the page. (A6/A7)</w:t>
+        <w:t>Task 3: Add a WhatsApp floating widget to the website (linked to your own phone number) and show it on the page. Paste a screenshot below. (A6/A7)</w:t>
       </w:r>
       <w:r>
         <w:rPr>
@@ -922,7 +922,7 @@
         <w:rPr>
           <w:rtl w:val="0"/>
         </w:rPr>
-        <w:t>Expected answer: a screenshot of the website showing the WhatsApp floating widget at the bottom-right (opens a chat to +65 9698 3731).</w:t>
+        <w:t>Expected answer: a screenshot of the website showing the WhatsApp floating widget at the bottom-right (opens a chat to the learner's own phone number).</w:t>
       </w:r>
     </w:p>
     <w:tbl>

</xml_diff>